<commit_message>
vault backup: 2026-06-26 20:18:10
Affected files:
wiki/career/卓_会员运营岗简历核对版.docx
wiki/career/目标公司深度分析与投递话术.md
wiki/career/硕牛-金融保险用户私域运营实战案例.pdf
卓_会员运营岗简历核对版.md
</commit_message>
<xml_diff>
--- a/wiki/career/卓_会员运营岗简历核对版.docx
+++ b/wiki/career/卓_会员运营岗简历核对版.docx
@@ -160,6 +160,7 @@
           <w:sz w:val="20"/>
         </w:rPr>
         <w:t>6年+持续深耕「围绕用户的精细化运营」——从会员体系搭建到私域增长，从数据驱动到AI提效。横跨酒店文旅、金融保险、跨境电商、服饰零售4个行业。</w:t>
+        <w:t xml:space="preserve"> 累计管理5-10人团队经验（谦腾4人、硕牛5人、万富1人+辅助）。</w:t>
       </w:r>
     </w:p>
     <w:p>
@@ -184,6 +185,7 @@
           <w:sz w:val="19"/>
         </w:rPr>
         <w:t>会员体系0-1 ｜ 用户分层与生命周期管理 ｜ 积分权益设计 ｜ 数据驱动增长（RFM/A/B测试） ｜ AI赋能运营</w:t>
+        <w:t xml:space="preserve"> ｜ 团队管理（带5-10人）</w:t>
       </w:r>
     </w:p>
     <w:p>
@@ -223,7 +225,7 @@
           <w:color w:val="6E6E6E"/>
           <w:sz w:val="18"/>
         </w:rPr>
-        <w:t>广州万富传媒有限公司（万富希尔顿酒店项目）  |  2024.06 - 2025.10</w:t>
+        <w:t>广州万富传媒有限公司（万富希尔顿酒店项目）  |  2024.06 - 2025.10  ｜ 带1人+协调文案/酒店销售等辅助资源</w:t>
       </w:r>
     </w:p>
     <w:p>
@@ -239,6 +241,7 @@
           <w:sz w:val="17"/>
         </w:rPr>
         <w:t>▸ 会员分层体系设计 · 积分权益搭建 · 会员活动IP · 多触点精细化运营 · 数据驱动复购提升</w:t>
+        <w:t xml:space="preserve"> · 小团队管理</w:t>
       </w:r>
     </w:p>
     <w:p>
@@ -338,7 +341,7 @@
           <w:color w:val="6E6E6E"/>
           <w:sz w:val="18"/>
         </w:rPr>
-        <w:t>硕牛·金融保险私域矩阵项目  |  2022.08 - 2024.05</w:t>
+        <w:t>硕牛·金融保险私域矩阵项目  |  2022.08 - 2024.05  ｜ 带5人团队</w:t>
       </w:r>
     </w:p>
     <w:p>
@@ -354,6 +357,7 @@
           <w:sz w:val="17"/>
         </w:rPr>
         <w:t>▸ 用户分层 · RFM模型 · 社群SOP · 留存与活跃度提升 · 百万级用户精细化运营</w:t>
+        <w:t xml:space="preserve"> · 团队管理</w:t>
       </w:r>
     </w:p>
     <w:p>
@@ -627,7 +631,7 @@
           <w:color w:val="6E6E6E"/>
           <w:sz w:val="18"/>
         </w:rPr>
-        <w:t>广州谦腾信息科技有限公司  |  2018.07 - 2019.07</w:t>
+        <w:t>广州谦腾信息科技有限公司  |  2018.07 - 2019.07  ｜ 带4人团队</w:t>
       </w:r>
     </w:p>
     <w:p>
@@ -643,6 +647,7 @@
           <w:sz w:val="17"/>
         </w:rPr>
         <w:t>▸ 用户裂变增长 · KOC生态 · 私域冷启动</w:t>
+        <w:t xml:space="preserve"> · 团队管理</w:t>
       </w:r>
     </w:p>
     <w:p>

</xml_diff>